<commit_message>
feat: provjera sažetka i literature (priča 2.3)
Co-Authored-By: Claude Opus 5.5 <noreply@anthropic.com>
</commit_message>
<xml_diff>
--- a/tests/referentni/vjezba_1/tekst_aptos.docx
+++ b/tests/referentni/vjezba_1/tekst_aptos.docx
@@ -23,7 +23,15 @@
       </w:r>
     </w:p>
     <w:p>
+      <w:pPr>
+        <w:ind w:left="1984" w:right="1984"/>
+        <w:jc w:val="both"/>
+      </w:pPr>
       <w:r>
+        <w:rPr>
+          <w:rFonts w:ascii="Calibri" w:hAnsi="Calibri"/>
+          <w:sz w:val="24"/>
+        </w:rPr>
         <w:t>Rad ukratko opisuje izbor studija i ciljeve studiranja.</w:t>
       </w:r>
     </w:p>
@@ -921,6 +929,10 @@
       <w:ind w:left="720"/>
       <w:contextualSpacing/>
     </w:pPr>
+    <w:rPr>
+      <w:rFonts w:ascii="Calibri" w:hAnsi="Calibri"/>
+      <w:sz w:val="24"/>
+    </w:rPr>
   </w:style>
   <w:style w:type="paragraph" w:styleId="BodyText">
     <w:name w:val="Body Text"/>

</xml_diff>